<commit_message>
docs: actualizar informe_laboratorio.docx con datos cruzados (healthcare+Drugs)
</commit_message>
<xml_diff>
--- a/informe_laboratorio.docx
+++ b/informe_laboratorio.docx
@@ -4,7 +4,6 @@
   <w:body>
     <w:p>
       <w:pPr>
-        <w:spacing w:before="0"/>
         <w:jc w:val="center"/>
       </w:pPr>
       <w:r>
@@ -28,11 +27,6 @@
         </w:rPr>
         <w:t>Sesión 5 · Evaluación (instrumento del PEA)</w:t>
       </w:r>
-    </w:p>
-    <w:p>
-      <w:pPr>
-        <w:spacing w:after="0"/>
-      </w:pPr>
     </w:p>
     <w:p>
       <w:pPr>
@@ -163,7 +157,7 @@
           <w:i w:val="0"/>
           <w:sz w:val="24"/>
         </w:rPr>
-        <w:t>Se presenta un análisis exploratorio del Healthcare Dataset (Kaggle), compuesto por 54.966 admisiones hospitalarias después del proceso de limpieza (55.500 registros crudos). El estudio evalúa la calidad de los datos, caracteriza las variables demográficas, clínicas y administrativas mediante análisis univariado, y examina las relaciones entre variables y el monto de facturación (Billing Amount) mediante análisis bivariado y multivariado. Los resultados muestran que las variables numéricas (edad, duración de la estancia) no se correlacionan linealmente con la facturación (r ≈ 0), y que no existen diferencias estadísticamente significativas en el monto facturado por tipo de admisión, género ni resultado de prueba. La única asociación significativa se observa para la condición médica Cáncer, cuya facturación media es menor que la del resto de condiciones (p = 0,004). Se identifican 106 facturas con monto negativo y se proponen segmentos de facturación y de edad como nuevas variables para futuros modelos.</w:t>
+        <w:t>Se presenta un análisis exploratorio del Healthcare Dataset (Kaggle), compuesto por 54.966 admisiones hospitalarias después del proceso de limpieza (55.500 registros crudos). El estudio evalúa la calidad de los datos, caracteriza las variables demográficas, clínicas y administrativas mediante análisis univariado, y examina las relaciones entre variables y el monto de facturación (Billing Amount) mediante análisis bivariado y multivariado, incluyendo el enriquecimiento del dataset con un catálogo de medicamentos (Drugs_product). Los resultados muestran que las variables numéricas (edad, duración de la estancia) no se correlacionan linealmente con la facturación (r ≈ 0), que no existen diferencias significativas en el monto facturado por tipo de admisión, género ni resultado de prueba, y que la única asociación significativa se observa para la condición médica Cáncer (menor facturación, p = 0,004). El cruce con el catálogo Drugs muestra que cada paciente recibe exactamente un medicamento, que los medicamentos son mutuamente excluyentes (r ≈ -0,25) y que la facturación se asocia levemente con las facturas negativas (r = -0,08). Se identifican 106 facturas con monto negativo y se proponen segmentos de facturación y de edad como nuevas variables.</w:t>
       </w:r>
     </w:p>
     <w:p>
@@ -178,7 +172,7 @@
           <w:i/>
           <w:sz w:val="24"/>
         </w:rPr>
-        <w:t>Palabras clave: minería de datos, análisis exploratorio, healthcare dataset, facturación hospitalaria, calidad de datos.</w:t>
+        <w:t>Palabras clave: minería de datos, análisis exploratorio, healthcare dataset, facturación hospitalaria, calidad de datos, cruce de datos, catálogo de medicamentos.</w:t>
       </w:r>
     </w:p>
     <w:p>
@@ -225,7 +219,7 @@
           <w:i w:val="0"/>
           <w:sz w:val="24"/>
         </w:rPr>
-        <w:t>¿Qué factores se asocian con el monto de facturación de las admisiones hospitalarias y qué patrones caracterizan a los pacientes atendidos?</w:t>
+        <w:t>¿Qué factores se asocian con el monto de facturación de las admisiones hospitalarias, qué patrones caracterizan a los pacientes y qué aporta el enriquecimiento con el catálogo de medicamentos?</w:t>
       </w:r>
     </w:p>
     <w:p>
@@ -297,6 +291,20 @@
           <w:rFonts w:ascii="Times New Roman" w:hAnsi="Times New Roman"/>
           <w:sz w:val="24"/>
         </w:rPr>
+        <w:t>Enriquecer el dataset con el catálogo Drugs_product y analizar el cruce.</w:t>
+      </w:r>
+    </w:p>
+    <w:p>
+      <w:pPr>
+        <w:pStyle w:val="ListBullet"/>
+        <w:spacing w:line="480" w:lineRule="auto" w:after="0"/>
+        <w:ind w:firstLine="0"/>
+      </w:pPr>
+      <w:r>
+        <w:rPr>
+          <w:rFonts w:ascii="Times New Roman" w:hAnsi="Times New Roman"/>
+          <w:sz w:val="24"/>
+        </w:rPr>
         <w:t>Proponer nuevas variables y segmentos, y validar al menos dos hipótesis explícitas con datos.</w:t>
       </w:r>
     </w:p>
@@ -313,7 +321,7 @@
           <w:i w:val="0"/>
           <w:sz w:val="24"/>
         </w:rPr>
-        <w:t>1.3 Dataset</w:t>
+        <w:t>1.3 Dataset y proceso</w:t>
       </w:r>
     </w:p>
     <w:p>
@@ -328,7 +336,99 @@
           <w:i w:val="0"/>
           <w:sz w:val="24"/>
         </w:rPr>
-        <w:t>Fuente: Healthcare Dataset (prasad22, 2024) de Kaggle. Contiene 55.500 admisiones hospitalarias con 15 columnas originales (datos del paciente, de la admisión y de la cuenta administrativa). Tras la limpieza quedan 54.966 registros y 16 columnas (se añade Factura_Negativa).</w:t>
+        <w:t>Fuente: Healthcare Dataset (prasad22, 2024) de Kaggle, con 55.500 admisiones y 15 columnas originales. Tras la limpieza quedan 54.966 registros y 16 columnas (se añade Factura_Negativa). El enriquecimiento con el catálogo Drugs_product (FDA) genera un dataset de 54.966 filas y 63 columnas, incorporando one-hot de variables categóricas, niveles (Medical Condition, Admission Type), segmento y edad robusta, y atributos farmacológicos por medicamento (PHARM_CLASSES, DOSAGEFORMNAME, ROUTENAME, DEASCHEDULE).</w:t>
+      </w:r>
+    </w:p>
+    <w:p>
+      <w:pPr>
+        <w:spacing w:before="120" w:line="240" w:lineRule="auto"/>
+        <w:ind w:firstLine="0"/>
+        <w:jc w:val="center"/>
+      </w:pPr>
+      <w:r>
+        <w:rPr>
+          <w:rFonts w:ascii="Times New Roman" w:hAnsi="Times New Roman"/>
+          <w:i/>
+          <w:sz w:val="24"/>
+        </w:rPr>
+        <w:t>Figura 0</w:t>
+      </w:r>
+    </w:p>
+    <w:p>
+      <w:pPr>
+        <w:spacing w:line="240" w:lineRule="auto" w:after="80"/>
+        <w:ind w:firstLine="0"/>
+        <w:jc w:val="center"/>
+      </w:pPr>
+      <w:r>
+        <w:rPr>
+          <w:rFonts w:ascii="Times New Roman" w:hAnsi="Times New Roman"/>
+          <w:i/>
+          <w:sz w:val="24"/>
+        </w:rPr>
+        <w:t>Flujo del proceso de limpieza, enriquecimiento y análisis.</w:t>
+      </w:r>
+    </w:p>
+    <w:p>
+      <w:pPr>
+        <w:jc w:val="center"/>
+      </w:pPr>
+      <w:r>
+        <w:drawing>
+          <wp:inline xmlns:a="http://schemas.openxmlformats.org/drawingml/2006/main" xmlns:pic="http://schemas.openxmlformats.org/drawingml/2006/picture">
+            <wp:extent cx="5486400" cy="31288383"/>
+            <wp:docPr id="1" name="Picture 1"/>
+            <wp:cNvGraphicFramePr>
+              <a:graphicFrameLocks noChangeAspect="1"/>
+            </wp:cNvGraphicFramePr>
+            <a:graphic>
+              <a:graphicData uri="http://schemas.openxmlformats.org/drawingml/2006/picture">
+                <pic:pic>
+                  <pic:nvPicPr>
+                    <pic:cNvPr id="0" name="fig0_flujo.png"/>
+                    <pic:cNvPicPr/>
+                  </pic:nvPicPr>
+                  <pic:blipFill>
+                    <a:blip r:embed="rId9"/>
+                    <a:stretch>
+                      <a:fillRect/>
+                    </a:stretch>
+                  </pic:blipFill>
+                  <pic:spPr>
+                    <a:xfrm>
+                      <a:off x="0" y="0"/>
+                      <a:ext cx="5486400" cy="31288383"/>
+                    </a:xfrm>
+                    <a:prstGeom prst="rect"/>
+                  </pic:spPr>
+                </pic:pic>
+              </a:graphicData>
+            </a:graphic>
+          </wp:inline>
+        </w:drawing>
+      </w:r>
+    </w:p>
+    <w:p>
+      <w:pPr>
+        <w:spacing w:line="240" w:lineRule="auto" w:after="240"/>
+        <w:ind w:firstLine="0"/>
+        <w:jc w:val="left"/>
+      </w:pPr>
+      <w:r>
+        <w:rPr>
+          <w:rFonts w:ascii="Times New Roman" w:hAnsi="Times New Roman"/>
+          <w:i/>
+          <w:sz w:val="20"/>
+        </w:rPr>
+        <w:t xml:space="preserve">Nota. </w:t>
+      </w:r>
+      <w:r>
+        <w:rPr>
+          <w:rFonts w:ascii="Times New Roman" w:hAnsi="Times New Roman"/>
+          <w:i/>
+          <w:sz w:val="20"/>
+        </w:rPr>
+        <w:t>El pipeline incluye la limpieza, el cruce con el catálogo Drugs y las etapas de análisis univariado, bivariado y de hallazgos.</w:t>
       </w:r>
     </w:p>
     <w:p>
@@ -883,7 +983,7 @@
           <w:i w:val="0"/>
           <w:sz w:val="24"/>
         </w:rPr>
-        <w:t>Nulos: no se encontraron valores faltantes en ninguna de las 16 variables, por lo que no fue necesaria imputación.</w:t>
+        <w:t>Nulos: no se encontraron valores faltantes en ninguna de las 16 variables del dataset limpio, por lo que no fue necesaria imputación.</w:t>
       </w:r>
     </w:p>
     <w:p>
@@ -898,7 +998,7 @@
           <w:i w:val="0"/>
           <w:sz w:val="24"/>
         </w:rPr>
-        <w:t>Duplicados: se detectaron 534 filas duplicadas en el crudo y se eliminaron antes de las cuentas posteriores, para no sesgar el diagnóstico.</w:t>
+        <w:t>Duplicados: se detectaron 534 filas duplicadas en el crudo y se eliminaron antes de las cuentas posteriores.</w:t>
       </w:r>
     </w:p>
     <w:p>
@@ -913,7 +1013,7 @@
           <w:i w:val="0"/>
           <w:sz w:val="24"/>
         </w:rPr>
-        <w:t>Outliers (IQR): aplicando la regla 1,5·IQR sobre Age y Billing Amount (excluyendo facturas negativas) no se detectaron valores fuera de rango. Age oscila entre 13 y 89 años; Billing Amount entre -2.008,49 y 52.764,28 USD.</w:t>
+        <w:t>Outliers (IQR): aplicando la regla 1,5·IQR sobre Age y Billing Amount (excluyendo facturas negativas) no se detectaron valores fuera de rango.</w:t>
       </w:r>
     </w:p>
     <w:p>
@@ -928,7 +1028,22 @@
           <w:i w:val="0"/>
           <w:sz w:val="24"/>
         </w:rPr>
-        <w:t>Facturas negativas: 106 registros presentan monto de facturación negativo. Se marcan en la variable Factura_Negativa sin modificar el monto original, por tratarse de dinero (dato sensible) y para no inventar valores.</w:t>
+        <w:t>Facturas negativas: 106 registros presentan monto de facturación negativo. Se marcan en la variable Factura_Negativa sin modificar el monto original.</w:t>
+      </w:r>
+    </w:p>
+    <w:p>
+      <w:pPr>
+        <w:spacing w:line="480" w:lineRule="auto" w:after="0"/>
+        <w:ind w:firstLine="720"/>
+      </w:pPr>
+      <w:r>
+        <w:rPr>
+          <w:rFonts w:ascii="Times New Roman" w:hAnsi="Times New Roman"/>
+          <w:b w:val="0"/>
+          <w:i w:val="0"/>
+          <w:sz w:val="24"/>
+        </w:rPr>
+        <w:t>Dataset enriquecido (cruce): presenta 1.121.314 valores nulos, concentrados en las columnas farmacológicas (MNAR: información no disponible en el catálogo, no error de captura). No se imputan. Num_Medicamentos = 1 para todos los registros (cada paciente recibe exactamente un medicamento).</w:t>
       </w:r>
     </w:p>
     <w:p>
@@ -959,7 +1074,7 @@
           <w:i w:val="0"/>
           <w:sz w:val="24"/>
         </w:rPr>
-        <w:t>Se presentan las estadísticas descriptivas de las variables numéricas principales y cuatro figuras interpretadas.</w:t>
+        <w:t>Se presentan las estadísticas descriptivas de las variables numéricas principales y las figuras interpretadas.</w:t>
       </w:r>
     </w:p>
     <w:p>
@@ -1420,7 +1535,6 @@
       <w:r>
         <w:rPr>
           <w:rFonts w:ascii="Times New Roman" w:hAnsi="Times New Roman"/>
-          <w:b w:val="0"/>
           <w:i/>
           <w:sz w:val="24"/>
         </w:rPr>
@@ -1450,7 +1564,7 @@
         <w:drawing>
           <wp:inline xmlns:a="http://schemas.openxmlformats.org/drawingml/2006/main" xmlns:pic="http://schemas.openxmlformats.org/drawingml/2006/picture">
             <wp:extent cx="5486400" cy="3135086"/>
-            <wp:docPr id="1" name="Picture 1"/>
+            <wp:docPr id="2" name="Picture 2"/>
             <wp:cNvGraphicFramePr>
               <a:graphicFrameLocks noChangeAspect="1"/>
             </wp:cNvGraphicFramePr>
@@ -1459,99 +1573,6 @@
                 <pic:pic>
                   <pic:nvPicPr>
                     <pic:cNvPr id="0" name="fig1_edad.png"/>
-                    <pic:cNvPicPr/>
-                  </pic:nvPicPr>
-                  <pic:blipFill>
-                    <a:blip r:embed="rId9"/>
-                    <a:stretch>
-                      <a:fillRect/>
-                    </a:stretch>
-                  </pic:blipFill>
-                  <pic:spPr>
-                    <a:xfrm>
-                      <a:off x="0" y="0"/>
-                      <a:ext cx="5486400" cy="3135086"/>
-                    </a:xfrm>
-                    <a:prstGeom prst="rect"/>
-                  </pic:spPr>
-                </pic:pic>
-              </a:graphicData>
-            </a:graphic>
-          </wp:inline>
-        </w:drawing>
-      </w:r>
-    </w:p>
-    <w:p>
-      <w:pPr>
-        <w:spacing w:line="240" w:lineRule="auto" w:after="240"/>
-        <w:ind w:firstLine="0"/>
-        <w:jc w:val="left"/>
-      </w:pPr>
-      <w:r>
-        <w:rPr>
-          <w:rFonts w:ascii="Times New Roman" w:hAnsi="Times New Roman"/>
-          <w:i/>
-          <w:sz w:val="20"/>
-        </w:rPr>
-        <w:t xml:space="preserve">Nota. </w:t>
-      </w:r>
-      <w:r>
-        <w:rPr>
-          <w:rFonts w:ascii="Times New Roman" w:hAnsi="Times New Roman"/>
-          <w:i/>
-          <w:sz w:val="20"/>
-        </w:rPr>
-        <w:t>La edad se distribuye de forma aproximadamente uniforme entre los 13 y 89 años, sin concentración en un grupo etario específico, lo que indica una muestra balanceada por edad.</w:t>
-      </w:r>
-    </w:p>
-    <w:p>
-      <w:pPr>
-        <w:spacing w:before="120" w:line="240" w:lineRule="auto"/>
-        <w:ind w:firstLine="0"/>
-        <w:jc w:val="center"/>
-      </w:pPr>
-      <w:r>
-        <w:rPr>
-          <w:rFonts w:ascii="Times New Roman" w:hAnsi="Times New Roman"/>
-          <w:b w:val="0"/>
-          <w:i/>
-          <w:sz w:val="24"/>
-        </w:rPr>
-        <w:t>Figura 2</w:t>
-      </w:r>
-    </w:p>
-    <w:p>
-      <w:pPr>
-        <w:spacing w:line="240" w:lineRule="auto" w:after="80"/>
-        <w:ind w:firstLine="0"/>
-        <w:jc w:val="center"/>
-      </w:pPr>
-      <w:r>
-        <w:rPr>
-          <w:rFonts w:ascii="Times New Roman" w:hAnsi="Times New Roman"/>
-          <w:i/>
-          <w:sz w:val="24"/>
-        </w:rPr>
-        <w:t>Distribución del monto de facturación.</w:t>
-      </w:r>
-    </w:p>
-    <w:p>
-      <w:pPr>
-        <w:jc w:val="center"/>
-      </w:pPr>
-      <w:r>
-        <w:drawing>
-          <wp:inline xmlns:a="http://schemas.openxmlformats.org/drawingml/2006/main" xmlns:pic="http://schemas.openxmlformats.org/drawingml/2006/picture">
-            <wp:extent cx="5486400" cy="3135086"/>
-            <wp:docPr id="2" name="Picture 2"/>
-            <wp:cNvGraphicFramePr>
-              <a:graphicFrameLocks noChangeAspect="1"/>
-            </wp:cNvGraphicFramePr>
-            <a:graphic>
-              <a:graphicData uri="http://schemas.openxmlformats.org/drawingml/2006/picture">
-                <pic:pic>
-                  <pic:nvPicPr>
-                    <pic:cNvPr id="0" name="fig2_billing.png"/>
                     <pic:cNvPicPr/>
                   </pic:nvPicPr>
                   <pic:blipFill>
@@ -1594,22 +1615,7 @@
           <w:i/>
           <w:sz w:val="20"/>
         </w:rPr>
-        <w:t>El monto de facturación presenta una distribución aproximadamente uniforme entre 0 y 52.764 USD, con media de 25.544 USD. No se observa sesgo marcado ni valores extremos (outliers IQR = 0).</w:t>
-      </w:r>
-    </w:p>
-    <w:p>
-      <w:pPr>
-        <w:spacing w:line="480" w:lineRule="auto" w:after="0"/>
-        <w:ind w:firstLine="720"/>
-      </w:pPr>
-      <w:r>
-        <w:rPr>
-          <w:rFonts w:ascii="Times New Roman" w:hAnsi="Times New Roman"/>
-          <w:b w:val="0"/>
-          <w:i w:val="0"/>
-          <w:sz w:val="24"/>
-        </w:rPr>
-        <w:t>Las condiciones médicas se distribuyen de forma equilibrada: Arthritis (9.218), Diabetes (9.216), Hypertension (9.151), Obesity (9.146), Cancer (9.140) y Asthma (9.095). Los tipos de admisión son Elective (18.473), Urgent (18.391) y Emergency (18.102), también balanceados. Los resultados de prueba se reparten entre Abnormal (18.437), Normal (18.331) e Inconclusive (18.198). El género es prácticamente paritario (Male 27.496, Female 27.470).</w:t>
+        <w:t>La edad se distribuye de forma aproximadamente uniforme entre los 13 y 89 años, sin concentración en un grupo etario específico.</w:t>
       </w:r>
     </w:p>
     <w:p>
@@ -1621,11 +1627,10 @@
       <w:r>
         <w:rPr>
           <w:rFonts w:ascii="Times New Roman" w:hAnsi="Times New Roman"/>
-          <w:b w:val="0"/>
           <w:i/>
           <w:sz w:val="24"/>
         </w:rPr>
-        <w:t>Figura 3</w:t>
+        <w:t>Figura 2</w:t>
       </w:r>
     </w:p>
     <w:p>
@@ -1640,7 +1645,7 @@
           <w:i/>
           <w:sz w:val="24"/>
         </w:rPr>
-        <w:t>Frecuencia de condiciones médicas.</w:t>
+        <w:t>Distribución del monto de facturación.</w:t>
       </w:r>
     </w:p>
     <w:p>
@@ -1659,7 +1664,7 @@
               <a:graphicData uri="http://schemas.openxmlformats.org/drawingml/2006/picture">
                 <pic:pic>
                   <pic:nvPicPr>
-                    <pic:cNvPr id="0" name="fig3_condicion.png"/>
+                    <pic:cNvPr id="0" name="fig2_billing.png"/>
                     <pic:cNvPicPr/>
                   </pic:nvPicPr>
                   <pic:blipFill>
@@ -1702,7 +1707,22 @@
           <w:i/>
           <w:sz w:val="20"/>
         </w:rPr>
-        <w:t>Las seis condiciones médicas tienen frecuencias similares (~9.000 casos cada una), lo que refleja un diseño balanceado del dataset y evita sesgos por categoría.</w:t>
+        <w:t>El monto de facturación presenta una distribución aproximadamente uniforme entre 0 y 52.764 USD, con media de 25.544 USD. No se observa sesgo marcado ni outliers IQR.</w:t>
+      </w:r>
+    </w:p>
+    <w:p>
+      <w:pPr>
+        <w:spacing w:line="480" w:lineRule="auto" w:after="0"/>
+        <w:ind w:firstLine="720"/>
+      </w:pPr>
+      <w:r>
+        <w:rPr>
+          <w:rFonts w:ascii="Times New Roman" w:hAnsi="Times New Roman"/>
+          <w:b w:val="0"/>
+          <w:i w:val="0"/>
+          <w:sz w:val="24"/>
+        </w:rPr>
+        <w:t>Las condiciones médicas se distribuyen de forma equilibrada: Arthritis (9.218), Diabetes (9.216), Hypertension (9.151), Obesity (9.146), Cancer (9.140) y Asthma (9.095). Los tipos de admisión son Elective (18.473), Urgent (18.391) y Emergency (18.102). Los resultados de prueba se reparten entre Abnormal (18.437), Normal (18.331) e Inconclusive (18.198). El género es prácticamente paritario (Male 27.496, Female 27.470).</w:t>
       </w:r>
     </w:p>
     <w:p>
@@ -1714,7 +1734,98 @@
       <w:r>
         <w:rPr>
           <w:rFonts w:ascii="Times New Roman" w:hAnsi="Times New Roman"/>
-          <w:b w:val="0"/>
+          <w:i/>
+          <w:sz w:val="24"/>
+        </w:rPr>
+        <w:t>Figura 3</w:t>
+      </w:r>
+    </w:p>
+    <w:p>
+      <w:pPr>
+        <w:spacing w:line="240" w:lineRule="auto" w:after="80"/>
+        <w:ind w:firstLine="0"/>
+        <w:jc w:val="center"/>
+      </w:pPr>
+      <w:r>
+        <w:rPr>
+          <w:rFonts w:ascii="Times New Roman" w:hAnsi="Times New Roman"/>
+          <w:i/>
+          <w:sz w:val="24"/>
+        </w:rPr>
+        <w:t>Frecuencia de condiciones médicas.</w:t>
+      </w:r>
+    </w:p>
+    <w:p>
+      <w:pPr>
+        <w:jc w:val="center"/>
+      </w:pPr>
+      <w:r>
+        <w:drawing>
+          <wp:inline xmlns:a="http://schemas.openxmlformats.org/drawingml/2006/main" xmlns:pic="http://schemas.openxmlformats.org/drawingml/2006/picture">
+            <wp:extent cx="5486400" cy="3135086"/>
+            <wp:docPr id="4" name="Picture 4"/>
+            <wp:cNvGraphicFramePr>
+              <a:graphicFrameLocks noChangeAspect="1"/>
+            </wp:cNvGraphicFramePr>
+            <a:graphic>
+              <a:graphicData uri="http://schemas.openxmlformats.org/drawingml/2006/picture">
+                <pic:pic>
+                  <pic:nvPicPr>
+                    <pic:cNvPr id="0" name="fig3_condicion.png"/>
+                    <pic:cNvPicPr/>
+                  </pic:nvPicPr>
+                  <pic:blipFill>
+                    <a:blip r:embed="rId12"/>
+                    <a:stretch>
+                      <a:fillRect/>
+                    </a:stretch>
+                  </pic:blipFill>
+                  <pic:spPr>
+                    <a:xfrm>
+                      <a:off x="0" y="0"/>
+                      <a:ext cx="5486400" cy="3135086"/>
+                    </a:xfrm>
+                    <a:prstGeom prst="rect"/>
+                  </pic:spPr>
+                </pic:pic>
+              </a:graphicData>
+            </a:graphic>
+          </wp:inline>
+        </w:drawing>
+      </w:r>
+    </w:p>
+    <w:p>
+      <w:pPr>
+        <w:spacing w:line="240" w:lineRule="auto" w:after="240"/>
+        <w:ind w:firstLine="0"/>
+        <w:jc w:val="left"/>
+      </w:pPr>
+      <w:r>
+        <w:rPr>
+          <w:rFonts w:ascii="Times New Roman" w:hAnsi="Times New Roman"/>
+          <w:i/>
+          <w:sz w:val="20"/>
+        </w:rPr>
+        <w:t xml:space="preserve">Nota. </w:t>
+      </w:r>
+      <w:r>
+        <w:rPr>
+          <w:rFonts w:ascii="Times New Roman" w:hAnsi="Times New Roman"/>
+          <w:i/>
+          <w:sz w:val="20"/>
+        </w:rPr>
+        <w:t>Las seis condiciones médicas tienen frecuencias similares (~9.000 casos cada una), reflejando un diseño balanceado del dataset.</w:t>
+      </w:r>
+    </w:p>
+    <w:p>
+      <w:pPr>
+        <w:spacing w:before="120" w:line="240" w:lineRule="auto"/>
+        <w:ind w:firstLine="0"/>
+        <w:jc w:val="center"/>
+      </w:pPr>
+      <w:r>
+        <w:rPr>
+          <w:rFonts w:ascii="Times New Roman" w:hAnsi="Times New Roman"/>
           <w:i/>
           <w:sz w:val="24"/>
         </w:rPr>
@@ -1744,7 +1855,7 @@
         <w:drawing>
           <wp:inline xmlns:a="http://schemas.openxmlformats.org/drawingml/2006/main" xmlns:pic="http://schemas.openxmlformats.org/drawingml/2006/picture">
             <wp:extent cx="5486400" cy="3657600"/>
-            <wp:docPr id="4" name="Picture 4"/>
+            <wp:docPr id="5" name="Picture 5"/>
             <wp:cNvGraphicFramePr>
               <a:graphicFrameLocks noChangeAspect="1"/>
             </wp:cNvGraphicFramePr>
@@ -1756,7 +1867,7 @@
                     <pic:cNvPicPr/>
                   </pic:nvPicPr>
                   <pic:blipFill>
-                    <a:blip r:embed="rId12"/>
+                    <a:blip r:embed="rId13"/>
                     <a:stretch>
                       <a:fillRect/>
                     </a:stretch>
@@ -1795,7 +1906,7 @@
           <w:i/>
           <w:sz w:val="20"/>
         </w:rPr>
-        <w:t>Los tres tipos de admisión (Elective, Urgent, Emergency) se presentan con frecuencias casi idénticas, lo que facilita comparaciones entre grupos.</w:t>
+        <w:t>Los tres tipos de admisión (Elective, Urgent, Emergency) se presentan con frecuencias casi idénticas.</w:t>
       </w:r>
     </w:p>
     <w:p>
@@ -1826,7 +1937,7 @@
           <w:i w:val="0"/>
           <w:sz w:val="24"/>
         </w:rPr>
-        <w:t>Se examinan las correlaciones entre variables numéricas y los cruces de la variable objetivo (Billing Amount) con variables categóricas.</w:t>
+        <w:t>Se examinan las correlaciones entre variables numéricas y los cruces de la variable objetivo (Billing Amount) con variables categóricas, incluyendo el dataset enriquecido.</w:t>
       </w:r>
     </w:p>
     <w:p>
@@ -1838,7 +1949,6 @@
       <w:r>
         <w:rPr>
           <w:rFonts w:ascii="Times New Roman" w:hAnsi="Times New Roman"/>
-          <w:b w:val="0"/>
           <w:i/>
           <w:sz w:val="24"/>
         </w:rPr>
@@ -1857,7 +1967,7 @@
           <w:i/>
           <w:sz w:val="24"/>
         </w:rPr>
-        <w:t>Matriz de correlación de variables numéricas.</w:t>
+        <w:t>Mapa de calor de correlaciones (datos cruzados).</w:t>
       </w:r>
     </w:p>
     <w:p>
@@ -1867,8 +1977,8 @@
       <w:r>
         <w:drawing>
           <wp:inline xmlns:a="http://schemas.openxmlformats.org/drawingml/2006/main" xmlns:pic="http://schemas.openxmlformats.org/drawingml/2006/picture">
-            <wp:extent cx="5486400" cy="4572000"/>
-            <wp:docPr id="5" name="Picture 5"/>
+            <wp:extent cx="5486400" cy="4940156"/>
+            <wp:docPr id="6" name="Picture 6"/>
             <wp:cNvGraphicFramePr>
               <a:graphicFrameLocks noChangeAspect="1"/>
             </wp:cNvGraphicFramePr>
@@ -1880,7 +1990,7 @@
                     <pic:cNvPicPr/>
                   </pic:nvPicPr>
                   <pic:blipFill>
-                    <a:blip r:embed="rId13"/>
+                    <a:blip r:embed="rId14"/>
                     <a:stretch>
                       <a:fillRect/>
                     </a:stretch>
@@ -1888,7 +1998,7 @@
                   <pic:spPr>
                     <a:xfrm>
                       <a:off x="0" y="0"/>
-                      <a:ext cx="5486400" cy="4572000"/>
+                      <a:ext cx="5486400" cy="4940156"/>
                     </a:xfrm>
                     <a:prstGeom prst="rect"/>
                   </pic:spPr>
@@ -1919,7 +2029,7 @@
           <w:i/>
           <w:sz w:val="20"/>
         </w:rPr>
-        <w:t>Las correlaciones entre Age, Billing Amount, Room Number y Estancia (días) son prácticamente nulas (|r| &lt; 0,01). No existe relación lineal entre la edad o la duración de la estancia y el monto facturado.</w:t>
+        <w:t>Heatmap sobre el dataset enriquecido (Age, Billing Amount, Medical Condition Nivel, Admission Type Nivel, Factura_Negativa y variables Medication_*). Las correlaciones más altas son estructurales: entre medicamentos son negativas (r ≈ -0,25) por ser mutuamente excluyentes (cada paciente recibe un solo medicamento). La única correlación con Billing Amount es con Factura_Negativa (r = -0,08). El resto de asociaciones son prácticamente nulas (|r| &lt; 0,01).</w:t>
       </w:r>
     </w:p>
     <w:p>
@@ -2440,7 +2550,6 @@
       <w:r>
         <w:rPr>
           <w:rFonts w:ascii="Times New Roman" w:hAnsi="Times New Roman"/>
-          <w:b w:val="0"/>
           <w:i/>
           <w:sz w:val="24"/>
         </w:rPr>
@@ -2470,7 +2579,7 @@
         <w:drawing>
           <wp:inline xmlns:a="http://schemas.openxmlformats.org/drawingml/2006/main" xmlns:pic="http://schemas.openxmlformats.org/drawingml/2006/picture">
             <wp:extent cx="5486400" cy="2743200"/>
-            <wp:docPr id="6" name="Picture 6"/>
+            <wp:docPr id="7" name="Picture 7"/>
             <wp:cNvGraphicFramePr>
               <a:graphicFrameLocks noChangeAspect="1"/>
             </wp:cNvGraphicFramePr>
@@ -2482,7 +2591,7 @@
                     <pic:cNvPicPr/>
                   </pic:nvPicPr>
                   <pic:blipFill>
-                    <a:blip r:embed="rId14"/>
+                    <a:blip r:embed="rId15"/>
                     <a:stretch>
                       <a:fillRect/>
                     </a:stretch>
@@ -3166,7 +3275,6 @@
       <w:r>
         <w:rPr>
           <w:rFonts w:ascii="Times New Roman" w:hAnsi="Times New Roman"/>
-          <w:b w:val="0"/>
           <w:i/>
           <w:sz w:val="24"/>
         </w:rPr>
@@ -3196,7 +3304,7 @@
         <w:drawing>
           <wp:inline xmlns:a="http://schemas.openxmlformats.org/drawingml/2006/main" xmlns:pic="http://schemas.openxmlformats.org/drawingml/2006/picture">
             <wp:extent cx="5486400" cy="3657600"/>
-            <wp:docPr id="7" name="Picture 7"/>
+            <wp:docPr id="8" name="Picture 8"/>
             <wp:cNvGraphicFramePr>
               <a:graphicFrameLocks noChangeAspect="1"/>
             </wp:cNvGraphicFramePr>
@@ -3208,7 +3316,7 @@
                     <pic:cNvPicPr/>
                   </pic:nvPicPr>
                   <pic:blipFill>
-                    <a:blip r:embed="rId15"/>
+                    <a:blip r:embed="rId16"/>
                     <a:stretch>
                       <a:fillRect/>
                     </a:stretch>
@@ -3247,7 +3355,23 @@
           <w:i/>
           <w:sz w:val="20"/>
         </w:rPr>
-        <w:t>Los resultados de prueba (Abnormal, Normal, Inconclusive) se distribuyen de forma casi idéntica, sin concentración en una categoría.</w:t>
+        <w:t>Los resultados de prueba (Abnormal, Normal, Inconclusive) se distribuyen de forma casi idéntica.</w:t>
+      </w:r>
+    </w:p>
+    <w:p>
+      <w:pPr>
+        <w:spacing w:before="160" w:after="120" w:line="480" w:lineRule="auto"/>
+        <w:ind w:firstLine="0"/>
+        <w:jc w:val="left"/>
+      </w:pPr>
+      <w:r>
+        <w:rPr>
+          <w:rFonts w:ascii="Times New Roman" w:hAnsi="Times New Roman"/>
+          <w:b/>
+          <w:i w:val="0"/>
+          <w:sz w:val="24"/>
+        </w:rPr>
+        <w:t>4.3 Datos cruzados: enriquecimiento con el catálogo Drugs</w:t>
       </w:r>
     </w:p>
     <w:p>
@@ -3262,7 +3386,607 @@
           <w:i w:val="0"/>
           <w:sz w:val="24"/>
         </w:rPr>
-        <w:t>Los cruces muestran que el monto de facturación es prácticamente homogéneo entre categorías: las medias por tipo de admisión varían en menos de 107 USD y por género en 140 USD. Los proveedores de seguro y los medicamentos también presentan medias similares (no mostradas por brevedad).</w:t>
+        <w:t>El dataset limpio se enriquece con el catálogo Drugs_product (FDA), que contiene información de medicamentos (clases terapéuticas, forma farmacéutica, vía de administración, clasificación DEA). El matching se realiza por nombre del medicamento (Aspirin, Ibuprofen, Lipitor, Paracetamol, Penicillin) y genera variables one-hot por medicamento más atributos farmacológicos.</w:t>
+      </w:r>
+    </w:p>
+    <w:p>
+      <w:pPr>
+        <w:spacing w:before="120" w:line="240" w:lineRule="auto"/>
+        <w:ind w:firstLine="0"/>
+        <w:jc w:val="left"/>
+      </w:pPr>
+      <w:r>
+        <w:rPr>
+          <w:rFonts w:ascii="Times New Roman" w:hAnsi="Times New Roman"/>
+          <w:b/>
+          <w:sz w:val="24"/>
+        </w:rPr>
+        <w:t>Tabla 5</w:t>
+      </w:r>
+    </w:p>
+    <w:p>
+      <w:pPr>
+        <w:spacing w:line="240" w:lineRule="auto" w:after="80"/>
+        <w:ind w:firstLine="0"/>
+        <w:jc w:val="left"/>
+      </w:pPr>
+      <w:r>
+        <w:rPr>
+          <w:rFonts w:ascii="Times New Roman" w:hAnsi="Times New Roman"/>
+          <w:i/>
+          <w:sz w:val="24"/>
+        </w:rPr>
+        <w:t>Cobertura del cruce healthcare–Drugs</w:t>
+      </w:r>
+    </w:p>
+    <w:tbl>
+      <w:tblPr>
+        <w:tblStyle w:val="TableGrid"/>
+        <w:tblW w:type="auto" w:w="0"/>
+        <w:jc w:val="center"/>
+        <w:tblLook w:firstColumn="1" w:firstRow="1" w:lastColumn="0" w:lastRow="0" w:noHBand="0" w:noVBand="1" w:val="04A0"/>
+      </w:tblPr>
+      <w:tblGrid>
+        <w:gridCol w:w="1872"/>
+        <w:gridCol w:w="1872"/>
+        <w:gridCol w:w="1872"/>
+        <w:gridCol w:w="1872"/>
+        <w:gridCol w:w="1872"/>
+      </w:tblGrid>
+      <w:tr>
+        <w:tc>
+          <w:tcPr>
+            <w:tcW w:type="dxa" w:w="1872"/>
+            <w:shd w:val="clear" w:color="auto" w:fill="D9E2F3"/>
+          </w:tcPr>
+          <w:p>
+            <w:r/>
+            <w:r>
+              <w:rPr>
+                <w:rFonts w:ascii="Times New Roman" w:hAnsi="Times New Roman"/>
+                <w:b/>
+                <w:sz w:val="20"/>
+              </w:rPr>
+              <w:t>Medicamento</w:t>
+            </w:r>
+          </w:p>
+        </w:tc>
+        <w:tc>
+          <w:tcPr>
+            <w:tcW w:type="dxa" w:w="1872"/>
+            <w:shd w:val="clear" w:color="auto" w:fill="D9E2F3"/>
+          </w:tcPr>
+          <w:p>
+            <w:r/>
+            <w:r>
+              <w:rPr>
+                <w:rFonts w:ascii="Times New Roman" w:hAnsi="Times New Roman"/>
+                <w:b/>
+                <w:sz w:val="20"/>
+              </w:rPr>
+              <w:t>Productos en catálogo</w:t>
+            </w:r>
+          </w:p>
+        </w:tc>
+        <w:tc>
+          <w:tcPr>
+            <w:tcW w:type="dxa" w:w="1872"/>
+            <w:shd w:val="clear" w:color="auto" w:fill="D9E2F3"/>
+          </w:tcPr>
+          <w:p>
+            <w:r/>
+            <w:r>
+              <w:rPr>
+                <w:rFonts w:ascii="Times New Roman" w:hAnsi="Times New Roman"/>
+                <w:b/>
+                <w:sz w:val="20"/>
+              </w:rPr>
+              <w:t>DEA Schedule</w:t>
+            </w:r>
+          </w:p>
+        </w:tc>
+        <w:tc>
+          <w:tcPr>
+            <w:tcW w:type="dxa" w:w="1872"/>
+            <w:shd w:val="clear" w:color="auto" w:fill="D9E2F3"/>
+          </w:tcPr>
+          <w:p>
+            <w:r/>
+            <w:r>
+              <w:rPr>
+                <w:rFonts w:ascii="Times New Roman" w:hAnsi="Times New Roman"/>
+                <w:b/>
+                <w:sz w:val="20"/>
+              </w:rPr>
+              <w:t>Vía</w:t>
+            </w:r>
+          </w:p>
+        </w:tc>
+        <w:tc>
+          <w:tcPr>
+            <w:tcW w:type="dxa" w:w="1872"/>
+            <w:shd w:val="clear" w:color="auto" w:fill="D9E2F3"/>
+          </w:tcPr>
+          <w:p>
+            <w:r/>
+            <w:r>
+              <w:rPr>
+                <w:rFonts w:ascii="Times New Roman" w:hAnsi="Times New Roman"/>
+                <w:b/>
+                <w:sz w:val="20"/>
+              </w:rPr>
+              <w:t>Sustancia activa</w:t>
+            </w:r>
+          </w:p>
+        </w:tc>
+      </w:tr>
+      <w:tr>
+        <w:tc>
+          <w:tcPr>
+            <w:tcW w:type="dxa" w:w="1872"/>
+          </w:tcPr>
+          <w:p>
+            <w:r/>
+            <w:r>
+              <w:rPr>
+                <w:rFonts w:ascii="Times New Roman" w:hAnsi="Times New Roman"/>
+                <w:sz w:val="20"/>
+              </w:rPr>
+              <w:t>Aspirin</w:t>
+            </w:r>
+          </w:p>
+        </w:tc>
+        <w:tc>
+          <w:tcPr>
+            <w:tcW w:type="dxa" w:w="1872"/>
+          </w:tcPr>
+          <w:p>
+            <w:r/>
+            <w:r>
+              <w:rPr>
+                <w:rFonts w:ascii="Times New Roman" w:hAnsi="Times New Roman"/>
+                <w:sz w:val="20"/>
+              </w:rPr>
+              <w:t>10.984</w:t>
+            </w:r>
+          </w:p>
+        </w:tc>
+        <w:tc>
+          <w:tcPr>
+            <w:tcW w:type="dxa" w:w="1872"/>
+          </w:tcPr>
+          <w:p>
+            <w:r/>
+            <w:r>
+              <w:rPr>
+                <w:rFonts w:ascii="Times New Roman" w:hAnsi="Times New Roman"/>
+                <w:sz w:val="20"/>
+              </w:rPr>
+              <w:t>CIII</w:t>
+            </w:r>
+          </w:p>
+        </w:tc>
+        <w:tc>
+          <w:tcPr>
+            <w:tcW w:type="dxa" w:w="1872"/>
+          </w:tcPr>
+          <w:p>
+            <w:r/>
+            <w:r>
+              <w:rPr>
+                <w:rFonts w:ascii="Times New Roman" w:hAnsi="Times New Roman"/>
+                <w:sz w:val="20"/>
+              </w:rPr>
+              <w:t>Oral</w:t>
+            </w:r>
+          </w:p>
+        </w:tc>
+        <w:tc>
+          <w:tcPr>
+            <w:tcW w:type="dxa" w:w="1872"/>
+          </w:tcPr>
+          <w:p>
+            <w:r/>
+            <w:r>
+              <w:rPr>
+                <w:rFonts w:ascii="Times New Roman" w:hAnsi="Times New Roman"/>
+                <w:sz w:val="20"/>
+              </w:rPr>
+              <w:t>Acetylsalicylic acid</w:t>
+            </w:r>
+          </w:p>
+        </w:tc>
+      </w:tr>
+      <w:tr>
+        <w:tc>
+          <w:tcPr>
+            <w:tcW w:type="dxa" w:w="1872"/>
+          </w:tcPr>
+          <w:p>
+            <w:r/>
+            <w:r>
+              <w:rPr>
+                <w:rFonts w:ascii="Times New Roman" w:hAnsi="Times New Roman"/>
+                <w:sz w:val="20"/>
+              </w:rPr>
+              <w:t>Ibuprofen</w:t>
+            </w:r>
+          </w:p>
+        </w:tc>
+        <w:tc>
+          <w:tcPr>
+            <w:tcW w:type="dxa" w:w="1872"/>
+          </w:tcPr>
+          <w:p>
+            <w:r/>
+            <w:r>
+              <w:rPr>
+                <w:rFonts w:ascii="Times New Roman" w:hAnsi="Times New Roman"/>
+                <w:sz w:val="20"/>
+              </w:rPr>
+              <w:t>11.023</w:t>
+            </w:r>
+          </w:p>
+        </w:tc>
+        <w:tc>
+          <w:tcPr>
+            <w:tcW w:type="dxa" w:w="1872"/>
+          </w:tcPr>
+          <w:p>
+            <w:r/>
+            <w:r>
+              <w:rPr>
+                <w:rFonts w:ascii="Times New Roman" w:hAnsi="Times New Roman"/>
+                <w:sz w:val="20"/>
+              </w:rPr>
+              <w:t>CII</w:t>
+            </w:r>
+          </w:p>
+        </w:tc>
+        <w:tc>
+          <w:tcPr>
+            <w:tcW w:type="dxa" w:w="1872"/>
+          </w:tcPr>
+          <w:p>
+            <w:r/>
+            <w:r>
+              <w:rPr>
+                <w:rFonts w:ascii="Times New Roman" w:hAnsi="Times New Roman"/>
+                <w:sz w:val="20"/>
+              </w:rPr>
+              <w:t>Oral</w:t>
+            </w:r>
+          </w:p>
+        </w:tc>
+        <w:tc>
+          <w:tcPr>
+            <w:tcW w:type="dxa" w:w="1872"/>
+          </w:tcPr>
+          <w:p>
+            <w:r/>
+            <w:r>
+              <w:rPr>
+                <w:rFonts w:ascii="Times New Roman" w:hAnsi="Times New Roman"/>
+                <w:sz w:val="20"/>
+              </w:rPr>
+              <w:t>Ibuprofen</w:t>
+            </w:r>
+          </w:p>
+        </w:tc>
+      </w:tr>
+      <w:tr>
+        <w:tc>
+          <w:tcPr>
+            <w:tcW w:type="dxa" w:w="1872"/>
+          </w:tcPr>
+          <w:p>
+            <w:r/>
+            <w:r>
+              <w:rPr>
+                <w:rFonts w:ascii="Times New Roman" w:hAnsi="Times New Roman"/>
+                <w:sz w:val="20"/>
+              </w:rPr>
+              <w:t>Lipitor</w:t>
+            </w:r>
+          </w:p>
+        </w:tc>
+        <w:tc>
+          <w:tcPr>
+            <w:tcW w:type="dxa" w:w="1872"/>
+          </w:tcPr>
+          <w:p>
+            <w:r/>
+            <w:r>
+              <w:rPr>
+                <w:rFonts w:ascii="Times New Roman" w:hAnsi="Times New Roman"/>
+                <w:sz w:val="20"/>
+              </w:rPr>
+              <w:t>11.038</w:t>
+            </w:r>
+          </w:p>
+        </w:tc>
+        <w:tc>
+          <w:tcPr>
+            <w:tcW w:type="dxa" w:w="1872"/>
+          </w:tcPr>
+          <w:p>
+            <w:r/>
+            <w:r>
+              <w:rPr>
+                <w:rFonts w:ascii="Times New Roman" w:hAnsi="Times New Roman"/>
+                <w:sz w:val="20"/>
+              </w:rPr>
+              <w:t>No clasificado</w:t>
+            </w:r>
+          </w:p>
+        </w:tc>
+        <w:tc>
+          <w:tcPr>
+            <w:tcW w:type="dxa" w:w="1872"/>
+          </w:tcPr>
+          <w:p>
+            <w:r/>
+            <w:r>
+              <w:rPr>
+                <w:rFonts w:ascii="Times New Roman" w:hAnsi="Times New Roman"/>
+                <w:sz w:val="20"/>
+              </w:rPr>
+              <w:t>Oral</w:t>
+            </w:r>
+          </w:p>
+        </w:tc>
+        <w:tc>
+          <w:tcPr>
+            <w:tcW w:type="dxa" w:w="1872"/>
+          </w:tcPr>
+          <w:p>
+            <w:r/>
+            <w:r>
+              <w:rPr>
+                <w:rFonts w:ascii="Times New Roman" w:hAnsi="Times New Roman"/>
+                <w:sz w:val="20"/>
+              </w:rPr>
+              <w:t>Atorvastatin</w:t>
+            </w:r>
+          </w:p>
+        </w:tc>
+      </w:tr>
+      <w:tr>
+        <w:tc>
+          <w:tcPr>
+            <w:tcW w:type="dxa" w:w="1872"/>
+          </w:tcPr>
+          <w:p>
+            <w:r/>
+            <w:r>
+              <w:rPr>
+                <w:rFonts w:ascii="Times New Roman" w:hAnsi="Times New Roman"/>
+                <w:sz w:val="20"/>
+              </w:rPr>
+              <w:t>Paracetamol</w:t>
+            </w:r>
+          </w:p>
+        </w:tc>
+        <w:tc>
+          <w:tcPr>
+            <w:tcW w:type="dxa" w:w="1872"/>
+          </w:tcPr>
+          <w:p>
+            <w:r/>
+            <w:r>
+              <w:rPr>
+                <w:rFonts w:ascii="Times New Roman" w:hAnsi="Times New Roman"/>
+                <w:sz w:val="20"/>
+              </w:rPr>
+              <w:t>10.965</w:t>
+            </w:r>
+          </w:p>
+        </w:tc>
+        <w:tc>
+          <w:tcPr>
+            <w:tcW w:type="dxa" w:w="1872"/>
+          </w:tcPr>
+          <w:p>
+            <w:r/>
+            <w:r>
+              <w:rPr>
+                <w:rFonts w:ascii="Times New Roman" w:hAnsi="Times New Roman"/>
+                <w:sz w:val="20"/>
+              </w:rPr>
+              <w:t>CII</w:t>
+            </w:r>
+          </w:p>
+        </w:tc>
+        <w:tc>
+          <w:tcPr>
+            <w:tcW w:type="dxa" w:w="1872"/>
+          </w:tcPr>
+          <w:p>
+            <w:r/>
+            <w:r>
+              <w:rPr>
+                <w:rFonts w:ascii="Times New Roman" w:hAnsi="Times New Roman"/>
+                <w:sz w:val="20"/>
+              </w:rPr>
+              <w:t>Oral</w:t>
+            </w:r>
+          </w:p>
+        </w:tc>
+        <w:tc>
+          <w:tcPr>
+            <w:tcW w:type="dxa" w:w="1872"/>
+          </w:tcPr>
+          <w:p>
+            <w:r/>
+            <w:r>
+              <w:rPr>
+                <w:rFonts w:ascii="Times New Roman" w:hAnsi="Times New Roman"/>
+                <w:sz w:val="20"/>
+              </w:rPr>
+              <w:t>Acetaminophen</w:t>
+            </w:r>
+          </w:p>
+        </w:tc>
+      </w:tr>
+      <w:tr>
+        <w:tc>
+          <w:tcPr>
+            <w:tcW w:type="dxa" w:w="1872"/>
+          </w:tcPr>
+          <w:p>
+            <w:r/>
+            <w:r>
+              <w:rPr>
+                <w:rFonts w:ascii="Times New Roman" w:hAnsi="Times New Roman"/>
+                <w:sz w:val="20"/>
+              </w:rPr>
+              <w:t>Penicillin</w:t>
+            </w:r>
+          </w:p>
+        </w:tc>
+        <w:tc>
+          <w:tcPr>
+            <w:tcW w:type="dxa" w:w="1872"/>
+          </w:tcPr>
+          <w:p>
+            <w:r/>
+            <w:r>
+              <w:rPr>
+                <w:rFonts w:ascii="Times New Roman" w:hAnsi="Times New Roman"/>
+                <w:sz w:val="20"/>
+              </w:rPr>
+              <w:t>10.956</w:t>
+            </w:r>
+          </w:p>
+        </w:tc>
+        <w:tc>
+          <w:tcPr>
+            <w:tcW w:type="dxa" w:w="1872"/>
+          </w:tcPr>
+          <w:p>
+            <w:r/>
+            <w:r>
+              <w:rPr>
+                <w:rFonts w:ascii="Times New Roman" w:hAnsi="Times New Roman"/>
+                <w:sz w:val="20"/>
+              </w:rPr>
+              <w:t>No clasificado</w:t>
+            </w:r>
+          </w:p>
+        </w:tc>
+        <w:tc>
+          <w:tcPr>
+            <w:tcW w:type="dxa" w:w="1872"/>
+          </w:tcPr>
+          <w:p>
+            <w:r/>
+            <w:r>
+              <w:rPr>
+                <w:rFonts w:ascii="Times New Roman" w:hAnsi="Times New Roman"/>
+                <w:sz w:val="20"/>
+              </w:rPr>
+              <w:t>Oral/Parenteral</w:t>
+            </w:r>
+          </w:p>
+        </w:tc>
+        <w:tc>
+          <w:tcPr>
+            <w:tcW w:type="dxa" w:w="1872"/>
+          </w:tcPr>
+          <w:p>
+            <w:r/>
+            <w:r>
+              <w:rPr>
+                <w:rFonts w:ascii="Times New Roman" w:hAnsi="Times New Roman"/>
+                <w:sz w:val="20"/>
+              </w:rPr>
+              <w:t>Penicillin</w:t>
+            </w:r>
+          </w:p>
+        </w:tc>
+      </w:tr>
+    </w:tbl>
+    <w:p>
+      <w:pPr>
+        <w:spacing w:line="240" w:lineRule="auto" w:after="240"/>
+        <w:ind w:firstLine="0"/>
+        <w:jc w:val="left"/>
+      </w:pPr>
+      <w:r>
+        <w:rPr>
+          <w:rFonts w:ascii="Times New Roman" w:hAnsi="Times New Roman"/>
+          <w:i/>
+          <w:sz w:val="20"/>
+        </w:rPr>
+        <w:t xml:space="preserve">Nota. </w:t>
+      </w:r>
+      <w:r>
+        <w:rPr>
+          <w:rFonts w:ascii="Times New Roman" w:hAnsi="Times New Roman"/>
+          <w:i/>
+          <w:sz w:val="20"/>
+        </w:rPr>
+        <w:t>Elaboración propia a partir de Drugs_product (FDA). Cada paciente recibe exactamente un medicamento (Num_Medicamentos = 1).</w:t>
+      </w:r>
+    </w:p>
+    <w:p>
+      <w:pPr>
+        <w:spacing w:line="480" w:lineRule="auto" w:after="0"/>
+        <w:ind w:firstLine="720"/>
+      </w:pPr>
+      <w:r>
+        <w:rPr>
+          <w:rFonts w:ascii="Times New Roman" w:hAnsi="Times New Roman"/>
+          <w:b w:val="0"/>
+          <w:i w:val="0"/>
+          <w:sz w:val="24"/>
+        </w:rPr>
+        <w:t>Los valores nulos en las columnas farmacológicas (1.121.314 en total) son de tipo MNAR (Missing Not At Random): la información no está disponible en el catálogo, no es un error de captura. No se imputan.</w:t>
+      </w:r>
+    </w:p>
+    <w:p>
+      <w:pPr>
+        <w:spacing w:line="480" w:lineRule="auto" w:after="0"/>
+        <w:ind w:firstLine="720"/>
+      </w:pPr>
+      <w:r>
+        <w:rPr>
+          <w:rFonts w:ascii="Times New Roman" w:hAnsi="Times New Roman"/>
+          <w:b w:val="0"/>
+          <w:i w:val="0"/>
+          <w:sz w:val="24"/>
+        </w:rPr>
+        <w:t>Las variables Medication_&lt;medicamento&gt; son mutuamente excluyentes: cada paciente tiene exactamente un medicamento, por lo que sus correlaciones son negativas (r ≈ -0,25) y estructurales, no indicativas de asociación causal.</w:t>
+      </w:r>
+    </w:p>
+    <w:p>
+      <w:pPr>
+        <w:spacing w:line="480" w:lineRule="auto" w:after="0"/>
+        <w:ind w:firstLine="720"/>
+      </w:pPr>
+      <w:r>
+        <w:rPr>
+          <w:rFonts w:ascii="Times New Roman" w:hAnsi="Times New Roman"/>
+          <w:b w:val="0"/>
+          <w:i w:val="0"/>
+          <w:sz w:val="24"/>
+        </w:rPr>
+        <w:t>La clasificación DEA muestra que Ibuprofen y Paracetamol son CII (sustancias controladas), Aspirin es CIII, mientras que Lipitor y Penicillin no tienen clasificación DEA en el catálogo.</w:t>
+      </w:r>
+    </w:p>
+    <w:p>
+      <w:pPr>
+        <w:spacing w:line="480" w:lineRule="auto" w:after="0"/>
+        <w:ind w:firstLine="720"/>
+      </w:pPr>
+      <w:r>
+        <w:rPr>
+          <w:rFonts w:ascii="Times New Roman" w:hAnsi="Times New Roman"/>
+          <w:b w:val="0"/>
+          <w:i w:val="0"/>
+          <w:sz w:val="24"/>
+        </w:rPr>
+        <w:t>Los cruces muestran que el monto de facturación es prácticamente homogéneo entre categorías: las medias por tipo de admisión varían en menos de 107 USD y por género en 140 USD.</w:t>
       </w:r>
     </w:p>
     <w:p>
@@ -3309,7 +4033,7 @@
           <w:i w:val="0"/>
           <w:sz w:val="24"/>
         </w:rPr>
-        <w:t>H1: "Las admisiones de emergencia tienen mayor monto de facturación que las electivas." → Rechazada. Prueba t de Student: t = -0,72; p = 0,472. No existe diferencia significativa entre Emergency (25.505 USD) y Elective (25.612 USD).</w:t>
+        <w:t>H1: "Las admisiones de emergencia tienen mayor monto de facturación que las electivas." → Rechazada. Prueba t: t = -0,72; p = 0,472. No existe diferencia significativa (Emergency 25.505 USD vs Elective 25.612 USD).</w:t>
       </w:r>
     </w:p>
     <w:p>
@@ -3324,7 +4048,7 @@
           <w:i w:val="0"/>
           <w:sz w:val="24"/>
         </w:rPr>
-        <w:t>H2: "Los pacientes de 65 años o más tienen mayor monto de facturación." → Rechazada. Prueba t: t = -1,22; p = 0,221. El grupo ≥65 años (25.431 USD) no difiere del grupo &lt;65 años (≈25.540 USD).</w:t>
+        <w:t>H2: "Los pacientes de 65 años o más tienen mayor monto de facturación." → Rechazada. Prueba t: t = -1,22; p = 0,221. El grupo ≥65 años (25.431 USD) no difiere del grupo &lt;65 años.</w:t>
       </w:r>
     </w:p>
     <w:p>
@@ -3339,7 +4063,22 @@
           <w:i w:val="0"/>
           <w:sz w:val="24"/>
         </w:rPr>
-        <w:t>H3: "La condición Cáncer se asocia con mayor facturación." → Rechazada e invertida. Prueba t: t = -2,89; p = 0,004. Cáncer presenta la media más baja (25.152 USD) frente al resto (≈25.610 USD), diferencia estadísticamente significativa.</w:t>
+        <w:t>H3: "La condición Cáncer se asocia con mayor facturación." → Rechazada e invertida. Prueba t: t = -2,89; p = 0,004. Cáncer presenta la media más baja (25.152 USD).</w:t>
+      </w:r>
+    </w:p>
+    <w:p>
+      <w:pPr>
+        <w:spacing w:line="480" w:lineRule="auto" w:after="0"/>
+        <w:ind w:firstLine="720"/>
+      </w:pPr>
+      <w:r>
+        <w:rPr>
+          <w:rFonts w:ascii="Times New Roman" w:hAnsi="Times New Roman"/>
+          <w:b w:val="0"/>
+          <w:i w:val="0"/>
+          <w:sz w:val="24"/>
+        </w:rPr>
+        <w:t>H4: "El medicamento prescrito se asocia con diferencias en la facturación." → Rechazada. Las medias de Billing Amount por medicamento son prácticamente idénticas (~25.500 USD), sin diferencias significativas; las correlaciones entre Medication_* y Billing Amount son ~0.</w:t>
       </w:r>
     </w:p>
     <w:p>
@@ -3398,6 +4137,34 @@
           <w:sz w:val="24"/>
         </w:rPr>
         <w:t>Segmento de edad: 0–17, 18–34, 35–49, 50–64 y 65+ años.</w:t>
+      </w:r>
+    </w:p>
+    <w:p>
+      <w:pPr>
+        <w:pStyle w:val="ListBullet"/>
+        <w:spacing w:line="480" w:lineRule="auto" w:after="0"/>
+        <w:ind w:firstLine="0"/>
+      </w:pPr>
+      <w:r>
+        <w:rPr>
+          <w:rFonts w:ascii="Times New Roman" w:hAnsi="Times New Roman"/>
+          <w:sz w:val="24"/>
+        </w:rPr>
+        <w:t>Atributos farmacológicos por medicamento (PHARM_CLASSES, DOSAGEFORMNAME, ROUTENAME, DEASCHEDULE) incorporados desde el catálogo Drugs.</w:t>
+      </w:r>
+    </w:p>
+    <w:p>
+      <w:pPr>
+        <w:pStyle w:val="ListBullet"/>
+        <w:spacing w:line="480" w:lineRule="auto" w:after="0"/>
+        <w:ind w:firstLine="0"/>
+      </w:pPr>
+      <w:r>
+        <w:rPr>
+          <w:rFonts w:ascii="Times New Roman" w:hAnsi="Times New Roman"/>
+          <w:sz w:val="24"/>
+        </w:rPr>
+        <w:t>Num_Medicamentos: conteo de medicamentos activos por admisión (constante = 1).</w:t>
       </w:r>
     </w:p>
     <w:p>
@@ -3554,6 +4321,21 @@
     <w:p>
       <w:pPr>
         <w:spacing w:line="480" w:lineRule="auto" w:after="0"/>
+        <w:ind w:firstLine="0"/>
+      </w:pPr>
+      <w:r>
+        <w:rPr>
+          <w:rFonts w:ascii="Times New Roman" w:hAnsi="Times New Roman"/>
+          <w:b/>
+          <w:i w:val="0"/>
+          <w:sz w:val="24"/>
+        </w:rPr>
+        <w:t>Hallazgo 4. Asociación entre facturación y facturas negativas.</w:t>
+      </w:r>
+    </w:p>
+    <w:p>
+      <w:pPr>
+        <w:spacing w:line="480" w:lineRule="auto" w:after="0"/>
         <w:ind w:firstLine="720"/>
       </w:pPr>
       <w:r>
@@ -3563,7 +4345,82 @@
           <w:i w:val="0"/>
           <w:sz w:val="24"/>
         </w:rPr>
-        <w:t>Hallazgo adicional. Anomalía administrativa: 106 facturas con monto negativo (Factura_Negativa = True) permanecen marcadas sin imputación, al tratarse de dinero (dato sensible). Se recomienda auditar estos registros.</w:t>
+        <w:t>Evidencia: Billing Amount se correlaciona con Factura_Negativa (r = -0,08), la correlación más alta observada con la facturación; existen 106 facturas con monto negativo.</w:t>
+      </w:r>
+    </w:p>
+    <w:p>
+      <w:pPr>
+        <w:spacing w:line="480" w:lineRule="auto" w:after="0"/>
+        <w:ind w:firstLine="720"/>
+      </w:pPr>
+      <w:r>
+        <w:rPr>
+          <w:rFonts w:ascii="Times New Roman" w:hAnsi="Times New Roman"/>
+          <w:b w:val="0"/>
+          <w:i w:val="0"/>
+          <w:sz w:val="24"/>
+        </w:rPr>
+        <w:t>Acción: auditar los 106 registros con monto negativo, ya que representan anomalías administrativas que distorsionan los totales y deben corregirse en origen.</w:t>
+      </w:r>
+    </w:p>
+    <w:p>
+      <w:pPr>
+        <w:spacing w:line="480" w:lineRule="auto" w:after="0"/>
+        <w:ind w:firstLine="0"/>
+      </w:pPr>
+      <w:r>
+        <w:rPr>
+          <w:rFonts w:ascii="Times New Roman" w:hAnsi="Times New Roman"/>
+          <w:b/>
+          <w:i w:val="0"/>
+          <w:sz w:val="24"/>
+        </w:rPr>
+        <w:t>Hallazgo 5. El medicamento no explica la facturación.</w:t>
+      </w:r>
+    </w:p>
+    <w:p>
+      <w:pPr>
+        <w:spacing w:line="480" w:lineRule="auto" w:after="0"/>
+        <w:ind w:firstLine="720"/>
+      </w:pPr>
+      <w:r>
+        <w:rPr>
+          <w:rFonts w:ascii="Times New Roman" w:hAnsi="Times New Roman"/>
+          <w:b w:val="0"/>
+          <w:i w:val="0"/>
+          <w:sz w:val="24"/>
+        </w:rPr>
+        <w:t>Evidencia: las medias de Billing Amount por medicamento son prácticamente idénticas (~25.500 USD) y las correlaciones entre Medication_* y Billing Amount son ~0.</w:t>
+      </w:r>
+    </w:p>
+    <w:p>
+      <w:pPr>
+        <w:spacing w:line="480" w:lineRule="auto" w:after="0"/>
+        <w:ind w:firstLine="720"/>
+      </w:pPr>
+      <w:r>
+        <w:rPr>
+          <w:rFonts w:ascii="Times New Roman" w:hAnsi="Times New Roman"/>
+          <w:b w:val="0"/>
+          <w:i w:val="0"/>
+          <w:sz w:val="24"/>
+        </w:rPr>
+        <w:t>Acción: la prescripción farmacológica no es un determinante del costo de la admisión; para modelar costos se requieren variables de procedimiento y consumo de recursos.</w:t>
+      </w:r>
+    </w:p>
+    <w:p>
+      <w:pPr>
+        <w:spacing w:line="480" w:lineRule="auto" w:after="0"/>
+        <w:ind w:firstLine="720"/>
+      </w:pPr>
+      <w:r>
+        <w:rPr>
+          <w:rFonts w:ascii="Times New Roman" w:hAnsi="Times New Roman"/>
+          <w:b w:val="0"/>
+          <w:i w:val="0"/>
+          <w:sz w:val="24"/>
+        </w:rPr>
+        <w:t>Hallazgo adicional. Los nulos del dataset enriquecido son MNAR (información no disponible en el catálogo) y no se imputan, preservando la trazabilidad del cruce.</w:t>
       </w:r>
     </w:p>
     <w:p>
@@ -3709,6 +4566,195 @@
           <w:i w:val="0"/>
           <w:sz w:val="22"/>
         </w:rPr>
+        <w:t>src/main_cruce.py</w:t>
+      </w:r>
+    </w:p>
+    <w:p>
+      <w:pPr>
+        <w:spacing w:line="240" w:lineRule="auto" w:after="160"/>
+        <w:ind w:firstLine="0"/>
+      </w:pPr>
+      <w:r>
+        <w:rPr>
+          <w:rFonts w:ascii="Consolas" w:hAnsi="Consolas"/>
+          <w:sz w:val="18"/>
+        </w:rPr>
+        <w:t>import pandas as pd</w:t>
+        <w:br/>
+        <w:br/>
+        <w:t>from repositorios.cargador import CargadorDataset</w:t>
+        <w:br/>
+        <w:t>from servicios.limpieza import NormalizadorDrugs</w:t>
+        <w:br/>
+        <w:t>from servicios.cruce import EnriquecedorHealthcareDrugs</w:t>
+        <w:br/>
+        <w:t>from utilidades.constantes import (</w:t>
+        <w:br/>
+        <w:t xml:space="preserve">    ARCHIVO_TRANSFORMADO,</w:t>
+        <w:br/>
+        <w:t xml:space="preserve">    ARCHIVO_ENRIQUECIDO,</w:t>
+        <w:br/>
+        <w:t xml:space="preserve">    ARCHIVO_ANALISIS,</w:t>
+        <w:br/>
+        <w:t xml:space="preserve">    ARCHIVO_DRUGS_PRODUCT,</w:t>
+        <w:br/>
+        <w:t xml:space="preserve">    MEDICAMENTOS_MAPEO,</w:t>
+        <w:br/>
+        <w:t>)</w:t>
+        <w:br/>
+        <w:br/>
+        <w:br/>
+        <w:t>class PipelineCruce:</w:t>
+        <w:br/>
+        <w:t xml:space="preserve">    def __init__(self):</w:t>
+        <w:br/>
+        <w:t xml:space="preserve">        self.cargadorHealthcare = CargadorDataset(ARCHIVO_TRANSFORMADO)</w:t>
+        <w:br/>
+        <w:t xml:space="preserve">        self.cargadorDrugs = CargadorDataset(ARCHIVO_DRUGS_PRODUCT, encoding="latin-1")</w:t>
+        <w:br/>
+        <w:t xml:space="preserve">        self.normalizadorDrugs = NormalizadorDrugs()</w:t>
+        <w:br/>
+        <w:t xml:space="preserve">        self.enriquecedor = None</w:t>
+        <w:br/>
+        <w:br/>
+        <w:t xml:space="preserve">    def ejecutar(self):</w:t>
+        <w:br/>
+        <w:t xml:space="preserve">        print("=== Cargando healthcare transformado ===")</w:t>
+        <w:br/>
+        <w:t xml:space="preserve">        dfHealthcare = self.cargadorHealthcare.cargar()</w:t>
+        <w:br/>
+        <w:t xml:space="preserve">        print("Filas:", len(dfHealthcare), "Columnas:", len(dfHealthcare.columns))</w:t>
+        <w:br/>
+        <w:br/>
+        <w:t xml:space="preserve">        print("\n=== Cargando Drugs_product.csv ===")</w:t>
+        <w:br/>
+        <w:t xml:space="preserve">        dfDrugs = self.cargadorDrugs.cargar()</w:t>
+        <w:br/>
+        <w:t xml:space="preserve">        print("Filas:", len(dfDrugs), "Columnas:", len(dfDrugs.columns))</w:t>
+        <w:br/>
+        <w:t xml:space="preserve">        print("Duplicados:", dfDrugs.duplicated().sum())</w:t>
+        <w:br/>
+        <w:t xml:space="preserve">        print("Nulos totales:", int(dfDrugs.isna().sum().sum()))</w:t>
+        <w:br/>
+        <w:t xml:space="preserve">        print("Nulos por columna:")</w:t>
+        <w:br/>
+        <w:t xml:space="preserve">        print(dfDrugs.isna().sum().sort_values(ascending=False).head(6).to_string())</w:t>
+        <w:br/>
+        <w:br/>
+        <w:t xml:space="preserve">        print("\n=== Normalizando Drugs ===")</w:t>
+        <w:br/>
+        <w:t xml:space="preserve">        dfDrugs = self.normalizadorDrugs.normalizar(dfDrugs)</w:t>
+        <w:br/>
+        <w:br/>
+        <w:t xml:space="preserve">        print("\n=== Enriqueciendo healthcare con Drugs ===")</w:t>
+        <w:br/>
+        <w:t xml:space="preserve">        self.enriquecedor = EnriquecedorHealthcareDrugs(dfDrugs)</w:t>
+        <w:br/>
+        <w:t xml:space="preserve">        print(self.enriquecedor.resumen_cobertura().to_string(index=False))</w:t>
+        <w:br/>
+        <w:br/>
+        <w:t xml:space="preserve">        dfEnriquecido, perfiles = self.enriquecedor.enriquecer(dfHealthcare)</w:t>
+        <w:br/>
+        <w:t xml:space="preserve">        print("\nForma enriquecida:", dfEnriquecido.shape)</w:t>
+        <w:br/>
+        <w:t xml:space="preserve">        print("Columnas nuevas:", [c for c in dfEnriquecido.columns if c not in dfHealthcare.columns])</w:t>
+        <w:br/>
+        <w:br/>
+        <w:t xml:space="preserve">        print("\n=== Diagnostico del dataset cruzado ===")</w:t>
+        <w:br/>
+        <w:t xml:space="preserve">        print("Duplicados:", dfEnriquecido.duplicated().sum())</w:t>
+        <w:br/>
+        <w:t xml:space="preserve">        print("Nulos totales:", int(dfEnriquecido.isna().sum().sum()))</w:t>
+        <w:br/>
+        <w:t xml:space="preserve">        nulos = dfEnriquecido.isna().sum()</w:t>
+        <w:br/>
+        <w:t xml:space="preserve">        print("Columnas con nulos:\n", nulos[nulos &gt; 0].to_string())</w:t>
+        <w:br/>
+        <w:t xml:space="preserve">        print("\nDescribe numericas:")</w:t>
+        <w:br/>
+        <w:t xml:space="preserve">        print(dfEnriquecido[["Age", "Billing Amount", "Num_Medicamentos"]].describe().round(2).to_string())</w:t>
+        <w:br/>
+        <w:br/>
+        <w:t xml:space="preserve">        print("\nClasificacion de faltantes: los NaN en columnas enriquecidas son MNAR")</w:t>
+        <w:br/>
+        <w:t xml:space="preserve">        print("(informacion no disponible en el catalogo, no error de captura). No se imputan.")</w:t>
+        <w:br/>
+        <w:br/>
+        <w:t xml:space="preserve">        print("\n=== Outliers (IQR) del cruzado ===")</w:t>
+        <w:br/>
+        <w:t xml:space="preserve">        from servicios.calidad import AnalizadorOutliers</w:t>
+        <w:br/>
+        <w:t xml:space="preserve">        AnalizadorOutliers(["Age", "Billing Amount"]).revisarIQR(dfEnriquecido)</w:t>
+        <w:br/>
+        <w:br/>
+        <w:t xml:space="preserve">        dfEnriquecido.to_csv(ARCHIVO_ENRIQUECIDO, index=False)</w:t>
+        <w:br/>
+        <w:t xml:space="preserve">        print("Archivo guardado:", ARCHIVO_ENRIQUECIDO)</w:t>
+        <w:br/>
+        <w:br/>
+        <w:t xml:space="preserve">        print("\n=== Analisis edad x medicamento ===")</w:t>
+        <w:br/>
+        <w:t xml:space="preserve">        flags = [f"Medication_{m}" for m in MEDICAMENTOS_MAPEO if f"Medication_{m}" in dfEnriquecido.columns]</w:t>
+        <w:br/>
+        <w:t xml:space="preserve">        filas = []</w:t>
+        <w:br/>
+        <w:t xml:space="preserve">        for segmento in sorted(dfEnriquecido["Age Segmento"].unique()):</w:t>
+        <w:br/>
+        <w:t xml:space="preserve">            sub = dfEnriquecido[dfEnriquecido["Age Segmento"] == segmento]</w:t>
+        <w:br/>
+        <w:t xml:space="preserve">            fila = {"Age Segmento": int(segmento), "Admisiones": len(sub)}</w:t>
+        <w:br/>
+        <w:t xml:space="preserve">            for f in flags:</w:t>
+        <w:br/>
+        <w:t xml:space="preserve">                fila[f] = int((sub[f] == 1).sum())</w:t>
+        <w:br/>
+        <w:t xml:space="preserve">            filas.append(fila)</w:t>
+        <w:br/>
+        <w:t xml:space="preserve">        dfAnalisis = pd.DataFrame(filas)</w:t>
+        <w:br/>
+        <w:t xml:space="preserve">        dfAnalisis.to_csv(ARCHIVO_ANALISIS, index=False)</w:t>
+        <w:br/>
+        <w:t xml:space="preserve">        print(dfAnalisis.to_string(index=False))</w:t>
+        <w:br/>
+        <w:t xml:space="preserve">        print("Archivo guardado:", ARCHIVO_ANALISIS)</w:t>
+        <w:br/>
+        <w:br/>
+        <w:t xml:space="preserve">        # resumen de enfermedades por medicamento activo</w:t>
+        <w:br/>
+        <w:t xml:space="preserve">        print("\n=== Medicamento vs Medical Condition Nivel (conteos) ===")</w:t>
+        <w:br/>
+        <w:t xml:space="preserve">        for m in MEDICAMENTOS_MAPEO:</w:t>
+        <w:br/>
+        <w:t xml:space="preserve">            col = f"Medication_{m}"</w:t>
+        <w:br/>
+        <w:t xml:space="preserve">            if col in dfEnriquecido.columns:</w:t>
+        <w:br/>
+        <w:t xml:space="preserve">                tab = dfEnriquecido[dfEnriquecido[col] == 1]["Medical Condition Nivel"].value_counts()</w:t>
+        <w:br/>
+        <w:t xml:space="preserve">                print(f"\n{m}:")</w:t>
+        <w:br/>
+        <w:t xml:space="preserve">                print(tab.to_string())</w:t>
+        <w:br/>
+        <w:br/>
+        <w:br/>
+        <w:t>if __name__ == "__main__":</w:t>
+        <w:br/>
+        <w:t xml:space="preserve">    PipelineCruce().ejecutar()</w:t>
+        <w:br/>
+      </w:r>
+    </w:p>
+    <w:p>
+      <w:pPr>
+        <w:spacing w:line="480" w:lineRule="auto" w:after="0"/>
+        <w:ind w:firstLine="0"/>
+      </w:pPr>
+      <w:r>
+        <w:rPr>
+          <w:rFonts w:ascii="Times New Roman" w:hAnsi="Times New Roman"/>
+          <w:b/>
+          <w:i w:val="0"/>
+          <w:sz w:val="22"/>
+        </w:rPr>
         <w:t>src/servicios/limpieza.py</w:t>
       </w:r>
     </w:p>
@@ -3929,6 +4975,223 @@
         <w:t xml:space="preserve">            print("Monto original conservado:", int((df.loc[df[self.columnaFlag], "Billing Amount"] &lt; 0).sum()) == negativos)</w:t>
         <w:br/>
         <w:t xml:space="preserve">        print("Edades fuera de rango:", int((~df["Age"].between(0, 120)).sum()))</w:t>
+      </w:r>
+    </w:p>
+    <w:p>
+      <w:pPr>
+        <w:spacing w:line="480" w:lineRule="auto" w:after="0"/>
+        <w:ind w:firstLine="0"/>
+      </w:pPr>
+      <w:r>
+        <w:rPr>
+          <w:rFonts w:ascii="Times New Roman" w:hAnsi="Times New Roman"/>
+          <w:b/>
+          <w:i w:val="0"/>
+          <w:sz w:val="22"/>
+        </w:rPr>
+        <w:t>src/servicios/cruce.py</w:t>
+      </w:r>
+    </w:p>
+    <w:p>
+      <w:pPr>
+        <w:spacing w:line="240" w:lineRule="auto" w:after="160"/>
+        <w:ind w:firstLine="0"/>
+      </w:pPr>
+      <w:r>
+        <w:rPr>
+          <w:rFonts w:ascii="Consolas" w:hAnsi="Consolas"/>
+          <w:sz w:val="18"/>
+        </w:rPr>
+        <w:t>import pandas as pd</w:t>
+        <w:br/>
+        <w:br/>
+        <w:t>from utilidades.constantes import MEDICAMENTOS_MAPEO, COLUMNAS_DRUGS, DRUGS_NOMINALES_ONEHOT</w:t>
+        <w:br/>
+        <w:br/>
+        <w:br/>
+        <w:t>def _coincide(row, terminos):</w:t>
+        <w:br/>
+        <w:t xml:space="preserve">    partes = []</w:t>
+        <w:br/>
+        <w:t xml:space="preserve">    for col in ["NONPROPRIETARYNAME", "PROPRIETARYNAME", "SUBSTANCENAME"]:</w:t>
+        <w:br/>
+        <w:t xml:space="preserve">        v = row.get(col, "")</w:t>
+        <w:br/>
+        <w:t xml:space="preserve">        if pd.isna(v):</w:t>
+        <w:br/>
+        <w:t xml:space="preserve">            continue</w:t>
+        <w:br/>
+        <w:t xml:space="preserve">        partes.append(str(v))</w:t>
+        <w:br/>
+        <w:t xml:space="preserve">    texto = " ".join(partes).lower()</w:t>
+        <w:br/>
+        <w:t xml:space="preserve">    return any(t in texto for t in terminos)</w:t>
+        <w:br/>
+        <w:br/>
+        <w:br/>
+        <w:t>class EnriquecedorHealthcareDrugs:</w:t>
+        <w:br/>
+        <w:t xml:space="preserve">    def __init__(self, dfDrugs):</w:t>
+        <w:br/>
+        <w:t xml:space="preserve">        self.dfDrugs = dfDrugs.copy()</w:t>
+        <w:br/>
+        <w:t xml:space="preserve">        # columna auxiliar de texto combinado en minúsculas para matching vectorizado</w:t>
+        <w:br/>
+        <w:t xml:space="preserve">        cols = ["NONPROPRIETARYNAME", "PROPRIETARYNAME", "SUBSTANCENAME"]</w:t>
+        <w:br/>
+        <w:t xml:space="preserve">        self.dfDrugs["_texto"] = ""</w:t>
+        <w:br/>
+        <w:t xml:space="preserve">        for c in cols:</w:t>
+        <w:br/>
+        <w:t xml:space="preserve">            if c in self.dfDrugs.columns:</w:t>
+        <w:br/>
+        <w:t xml:space="preserve">                self.dfDrugs["_texto"] = self.dfDrugs["_texto"] + " " + self.dfDrugs[c].fillna("").astype(str)</w:t>
+        <w:br/>
+        <w:t xml:space="preserve">        self.dfDrugs["_texto"] = self.dfDrugs["_texto"].str.lower()</w:t>
+        <w:br/>
+        <w:br/>
+        <w:t xml:space="preserve">    def _mask(self, terminos):</w:t>
+        <w:br/>
+        <w:t xml:space="preserve">        m = pd.Series(False, index=self.dfDrugs.index)</w:t>
+        <w:br/>
+        <w:t xml:space="preserve">        for t in terminos:</w:t>
+        <w:br/>
+        <w:t xml:space="preserve">            m = m | self.dfDrugs["_texto"].str.contains(t, regex=False, na=False)</w:t>
+        <w:br/>
+        <w:t xml:space="preserve">        return m</w:t>
+        <w:br/>
+        <w:br/>
+        <w:t xml:space="preserve">    def construir_perfil(self, terminos):</w:t>
+        <w:br/>
+        <w:t xml:space="preserve">        """Devuelve un dict con valores representativos (moda) para un medicamento."""</w:t>
+        <w:br/>
+        <w:t xml:space="preserve">        mask = self._mask(terminos)</w:t>
+        <w:br/>
+        <w:t xml:space="preserve">        sub = self.dfDrugs.loc[mask]</w:t>
+        <w:br/>
+        <w:t xml:space="preserve">        perfil = {"n_productos": len(sub)}</w:t>
+        <w:br/>
+        <w:t xml:space="preserve">        for col in COLUMNAS_DRUGS:</w:t>
+        <w:br/>
+        <w:t xml:space="preserve">            if col in sub.columns and len(sub) &gt; 0:</w:t>
+        <w:br/>
+        <w:t xml:space="preserve">                serie = sub[col].dropna()</w:t>
+        <w:br/>
+        <w:t xml:space="preserve">                if len(serie) &gt; 0:</w:t>
+        <w:br/>
+        <w:t xml:space="preserve">                    perfil[col] = serie.mode().iloc[0]</w:t>
+        <w:br/>
+        <w:t xml:space="preserve">                else:</w:t>
+        <w:br/>
+        <w:t xml:space="preserve">                    perfil[col] = None</w:t>
+        <w:br/>
+        <w:t xml:space="preserve">            else:</w:t>
+        <w:br/>
+        <w:t xml:space="preserve">                perfil[col] = None</w:t>
+        <w:br/>
+        <w:t xml:space="preserve">        # clases terapéuticas únicas (top)</w:t>
+        <w:br/>
+        <w:t xml:space="preserve">        if "PHARM_CLASSES" in sub.columns and len(sub) &gt; 0:</w:t>
+        <w:br/>
+        <w:t xml:space="preserve">            clases = set()</w:t>
+        <w:br/>
+        <w:t xml:space="preserve">            for v in sub["PHARM_CLASSES"].dropna():</w:t>
+        <w:br/>
+        <w:t xml:space="preserve">                for c in str(v).split(","):</w:t>
+        <w:br/>
+        <w:t xml:space="preserve">                    c = c.strip()</w:t>
+        <w:br/>
+        <w:t xml:space="preserve">                    if c:</w:t>
+        <w:br/>
+        <w:t xml:space="preserve">                        clases.add(c)</w:t>
+        <w:br/>
+        <w:t xml:space="preserve">            perfil["CLASES_UNICAS"] = "; ".join(sorted(clases)[:8])</w:t>
+        <w:br/>
+        <w:t xml:space="preserve">        else:</w:t>
+        <w:br/>
+        <w:t xml:space="preserve">            perfil["CLASES_UNICAS"] = None</w:t>
+        <w:br/>
+        <w:t xml:space="preserve">        return perfil</w:t>
+        <w:br/>
+        <w:br/>
+        <w:t xml:space="preserve">    def enriquecer(self, dfHealthcare):</w:t>
+        <w:br/>
+        <w:t xml:space="preserve">        df = dfHealthcare.copy()</w:t>
+        <w:br/>
+        <w:t xml:space="preserve">        perfiles = {}</w:t>
+        <w:br/>
+        <w:t xml:space="preserve">        for medicamento, terminos in MEDICAMENTOS_MAPEO.items():</w:t>
+        <w:br/>
+        <w:t xml:space="preserve">            perfiles[medicamento] = self.construir_perfil(terminos)</w:t>
+        <w:br/>
+        <w:br/>
+        <w:t xml:space="preserve">        # columnas enriquecidas por medicamento (solo donde el flag es 1)</w:t>
+        <w:br/>
+        <w:t xml:space="preserve">        for medicamento in MEDICAMENTOS_MAPEO:</w:t>
+        <w:br/>
+        <w:t xml:space="preserve">            colFlag = f"Medication_{medicamento}"</w:t>
+        <w:br/>
+        <w:t xml:space="preserve">            perfil = perfiles[medicamento]</w:t>
+        <w:br/>
+        <w:t xml:space="preserve">            for attr in ["PHARM_CLASSES", "DOSAGEFORMNAME", "ROUTENAME", "DEASCHEDULE", "CLASES_UNICAS"]:</w:t>
+        <w:br/>
+        <w:t xml:space="preserve">                colNueva = f"{colFlag}_{attr}"</w:t>
+        <w:br/>
+        <w:t xml:space="preserve">                df[colNueva] = None</w:t>
+        <w:br/>
+        <w:t xml:space="preserve">                if colFlag in df.columns:</w:t>
+        <w:br/>
+        <w:t xml:space="preserve">                    mask = df[colFlag] == 1</w:t>
+        <w:br/>
+        <w:t xml:space="preserve">                    df.loc[mask, colNueva] = perfil.get(attr)</w:t>
+        <w:br/>
+        <w:br/>
+        <w:t xml:space="preserve">        # columna combinada: clases terapéuticas de los medicamentos activos</w:t>
+        <w:br/>
+        <w:t xml:space="preserve">        def clases_activas(fila):</w:t>
+        <w:br/>
+        <w:t xml:space="preserve">            clases = []</w:t>
+        <w:br/>
+        <w:t xml:space="preserve">            for medicamento in MEDICAMENTOS_MAPEO:</w:t>
+        <w:br/>
+        <w:t xml:space="preserve">                colFlag = f"Medication_{medicamento}"</w:t>
+        <w:br/>
+        <w:t xml:space="preserve">                if colFlag in fila and fila[colFlag] == 1:</w:t>
+        <w:br/>
+        <w:t xml:space="preserve">                    p = perfiles[medicamento]</w:t>
+        <w:br/>
+        <w:t xml:space="preserve">                    if p.get("CLASES_UNICAS"):</w:t>
+        <w:br/>
+        <w:t xml:space="preserve">                        clases.append(f"{medicamento}: {p['CLASES_UNICAS']}")</w:t>
+        <w:br/>
+        <w:t xml:space="preserve">            return " | ".join(clases) if clases else None</w:t>
+        <w:br/>
+        <w:br/>
+        <w:t xml:space="preserve">        df["Medicamentos_Clases_Terapeuticas"] = df.apply(clases_activas, axis=1)</w:t>
+        <w:br/>
+        <w:br/>
+        <w:t xml:space="preserve">        # conteo de medicamentos activos por fila</w:t>
+        <w:br/>
+        <w:t xml:space="preserve">        flags = [f"Medication_{m}" for m in MEDICAMENTOS_MAPEO if f"Medication_{m}" in df.columns]</w:t>
+        <w:br/>
+        <w:t xml:space="preserve">        df["Num_Medicamentos"] = df[flags].sum(axis=1) if flags else 0</w:t>
+        <w:br/>
+        <w:br/>
+        <w:t xml:space="preserve">        return df, perfiles</w:t>
+        <w:br/>
+        <w:br/>
+        <w:t xml:space="preserve">    def resumen_cobertura(self):</w:t>
+        <w:br/>
+        <w:t xml:space="preserve">        out = []</w:t>
+        <w:br/>
+        <w:t xml:space="preserve">        for medicamento, terminos in MEDICAMENTOS_MAPEO.items():</w:t>
+        <w:br/>
+        <w:t xml:space="preserve">            p = self.construir_perfil(terminos)</w:t>
+        <w:br/>
+        <w:t xml:space="preserve">            out.append({"Medicamento": medicamento, "Productos_en_catalogo": p["n_productos"]})</w:t>
+        <w:br/>
+        <w:t xml:space="preserve">        return pd.DataFrame(out)</w:t>
+        <w:br/>
       </w:r>
     </w:p>
     <w:p>
@@ -4093,6 +5356,222 @@
         <w:t xml:space="preserve">    "MARKETINGCATEGORYNAME",</w:t>
         <w:br/>
         <w:t>]</w:t>
+      </w:r>
+    </w:p>
+    <w:p>
+      <w:pPr>
+        <w:spacing w:line="480" w:lineRule="auto" w:after="0"/>
+        <w:ind w:firstLine="0"/>
+      </w:pPr>
+      <w:r>
+        <w:rPr>
+          <w:rFonts w:ascii="Times New Roman" w:hAnsi="Times New Roman"/>
+          <w:b/>
+          <w:i w:val="0"/>
+          <w:sz w:val="22"/>
+        </w:rPr>
+        <w:t>src/analisis_correlaciones.py</w:t>
+      </w:r>
+    </w:p>
+    <w:p>
+      <w:pPr>
+        <w:spacing w:line="240" w:lineRule="auto" w:after="160"/>
+        <w:ind w:firstLine="0"/>
+      </w:pPr>
+      <w:r>
+        <w:rPr>
+          <w:rFonts w:ascii="Consolas" w:hAnsi="Consolas"/>
+          <w:sz w:val="18"/>
+        </w:rPr>
+        <w:t>﻿import numpy as np</w:t>
+        <w:br/>
+        <w:t>import pandas as pd</w:t>
+        <w:br/>
+        <w:t>import matplotlib.pyplot as plt</w:t>
+        <w:br/>
+        <w:t>import seaborn as sns</w:t>
+        <w:br/>
+        <w:br/>
+        <w:br/>
+        <w:t>def analizar_correlaciones(</w:t>
+        <w:br/>
+        <w:t xml:space="preserve">    df,</w:t>
+        <w:br/>
+        <w:t xml:space="preserve">    columnas=None,</w:t>
+        <w:br/>
+        <w:t xml:space="preserve">    metodo='pearson',</w:t>
+        <w:br/>
+        <w:t xml:space="preserve">    top_n=15,</w:t>
+        <w:br/>
+        <w:t xml:space="preserve">    figsize=(9, 7),</w:t>
+        <w:br/>
+        <w:t xml:space="preserve">    annot=False,</w:t>
+        <w:br/>
+        <w:t xml:space="preserve">    fmt='.2f',</w:t>
+        <w:br/>
+        <w:t xml:space="preserve">    triangulo=True,</w:t>
+        <w:br/>
+        <w:t xml:space="preserve">    cmap='coolwarm',</w:t>
+        <w:br/>
+        <w:t xml:space="preserve">    centro=0,</w:t>
+        <w:br/>
+        <w:t xml:space="preserve">    guardar_ruta=None,</w:t>
+        <w:br/>
+        <w:t xml:space="preserve">    mostrar=True,</w:t>
+        <w:br/>
+        <w:t>):</w:t>
+        <w:br/>
+        <w:t xml:space="preserve">    if columnas is None:</w:t>
+        <w:br/>
+        <w:t xml:space="preserve">        df_num = df.select_dtypes(include=['number']).copy()</w:t>
+        <w:br/>
+        <w:t xml:space="preserve">    else:</w:t>
+        <w:br/>
+        <w:t xml:space="preserve">        df_num = df[columnas].select_dtypes(include=['number']).copy()</w:t>
+        <w:br/>
+        <w:br/>
+        <w:t xml:space="preserve">    matriz_corr = df_num.corr(method=metodo)</w:t>
+        <w:br/>
+        <w:br/>
+        <w:t xml:space="preserve">    pares = []</w:t>
+        <w:br/>
+        <w:t xml:space="preserve">    cols = matriz_corr.columns</w:t>
+        <w:br/>
+        <w:t xml:space="preserve">    for i in range(len(cols)):</w:t>
+        <w:br/>
+        <w:t xml:space="preserve">        for j in range(i + 1, len(cols)):</w:t>
+        <w:br/>
+        <w:t xml:space="preserve">            r = matriz_corr.iloc[i, j]</w:t>
+        <w:br/>
+        <w:t xml:space="preserve">            if pd.notna(r):</w:t>
+        <w:br/>
+        <w:t xml:space="preserve">                pares.append((cols[i], cols[j], float(r), abs(float(r))))</w:t>
+        <w:br/>
+        <w:br/>
+        <w:t xml:space="preserve">    pares_ordenados = sorted(pares, key=lambda x: x[3], reverse=True)</w:t>
+        <w:br/>
+        <w:br/>
+        <w:t xml:space="preserve">    plt.figure(figsize=figsize)</w:t>
+        <w:br/>
+        <w:t xml:space="preserve">    if triangulo:</w:t>
+        <w:br/>
+        <w:t xml:space="preserve">        mask = np.triu(np.ones_like(matriz_corr, dtype=bool))</w:t>
+        <w:br/>
+        <w:t xml:space="preserve">    else:</w:t>
+        <w:br/>
+        <w:t xml:space="preserve">        mask = None</w:t>
+        <w:br/>
+        <w:t xml:space="preserve">    sns.heatmap(</w:t>
+        <w:br/>
+        <w:t xml:space="preserve">        matriz_corr,</w:t>
+        <w:br/>
+        <w:t xml:space="preserve">        mask=mask,</w:t>
+        <w:br/>
+        <w:t xml:space="preserve">        annot=annot,</w:t>
+        <w:br/>
+        <w:t xml:space="preserve">        fmt=fmt,</w:t>
+        <w:br/>
+        <w:t xml:space="preserve">        cmap=cmap,</w:t>
+        <w:br/>
+        <w:t xml:space="preserve">        center=centro,</w:t>
+        <w:br/>
+        <w:t xml:space="preserve">        square=True,</w:t>
+        <w:br/>
+        <w:t xml:space="preserve">        linewidths=0.5,</w:t>
+        <w:br/>
+        <w:t xml:space="preserve">        cbar_kws={'shrink': 0.8},</w:t>
+        <w:br/>
+        <w:t xml:space="preserve">    )</w:t>
+        <w:br/>
+        <w:t xml:space="preserve">    plt.title(f'Mapa de calor de correlaciones ({metodo})')</w:t>
+        <w:br/>
+        <w:t xml:space="preserve">    plt.tight_layout()</w:t>
+        <w:br/>
+        <w:br/>
+        <w:t xml:space="preserve">    if guardar_ruta is not None:</w:t>
+        <w:br/>
+        <w:t xml:space="preserve">        plt.savefig(guardar_ruta, dpi=150, bbox_inches='tight')</w:t>
+        <w:br/>
+        <w:t xml:space="preserve">        print(f'Figura guardada: {guardar_ruta}')</w:t>
+        <w:br/>
+        <w:br/>
+        <w:t xml:space="preserve">    if mostrar:</w:t>
+        <w:br/>
+        <w:t xml:space="preserve">        try:</w:t>
+        <w:br/>
+        <w:t xml:space="preserve">            plt.show()</w:t>
+        <w:br/>
+        <w:t xml:space="preserve">        except Exception:</w:t>
+        <w:br/>
+        <w:t xml:space="preserve">            pass</w:t>
+        <w:br/>
+        <w:t xml:space="preserve">    else:</w:t>
+        <w:br/>
+        <w:t xml:space="preserve">        plt.close()</w:t>
+        <w:br/>
+        <w:br/>
+        <w:t xml:space="preserve">    top = pares_ordenados[:top_n] if top_n &gt; 0 else pares_ordenados</w:t>
+        <w:br/>
+        <w:t xml:space="preserve">    df_pares = pd.DataFrame(</w:t>
+        <w:br/>
+        <w:t xml:space="preserve">        top,</w:t>
+        <w:br/>
+        <w:t xml:space="preserve">        columns=['Variable 1', 'Variable 2', 'r', '|r|'],</w:t>
+        <w:br/>
+        <w:t xml:space="preserve">    ).round(4)</w:t>
+        <w:br/>
+        <w:br/>
+        <w:t xml:space="preserve">    return {</w:t>
+        <w:br/>
+        <w:t xml:space="preserve">        'matriz': matriz_corr,</w:t>
+        <w:br/>
+        <w:t xml:space="preserve">        'pares_ordenados': pares_ordenados,</w:t>
+        <w:br/>
+        <w:t xml:space="preserve">        'top_pares': df_pares,</w:t>
+        <w:br/>
+        <w:t xml:space="preserve">    }</w:t>
+        <w:br/>
+        <w:br/>
+        <w:t>if __name__ == "__main__":</w:t>
+        <w:br/>
+        <w:t xml:space="preserve">    import sys</w:t>
+        <w:br/>
+        <w:t xml:space="preserve">    from pathlib import Path</w:t>
+        <w:br/>
+        <w:t xml:space="preserve">    sys.path.insert(0, str(Path(__file__).resolve().parent))</w:t>
+        <w:br/>
+        <w:t xml:space="preserve">    import pandas as pd</w:t>
+        <w:br/>
+        <w:t xml:space="preserve">    base = Path(__file__).resolve().parent.parent</w:t>
+        <w:br/>
+        <w:t xml:space="preserve">    df = pd.read_csv(base / "data" / "healthcare_dataset_enriquecido.csv")</w:t>
+        <w:br/>
+        <w:t xml:space="preserve">    cols = [</w:t>
+        <w:br/>
+        <w:t xml:space="preserve">        "Age", "Billing Amount", "Medical Condition Nivel", "Admission Type Nivel",</w:t>
+        <w:br/>
+        <w:t xml:space="preserve">        "Factura_Negativa",</w:t>
+        <w:br/>
+        <w:t xml:space="preserve">        "Medication_Aspirin", "Medication_Ibuprofen", "Medication_Lipitor",</w:t>
+        <w:br/>
+        <w:t xml:space="preserve">        "Medication_Paracetamol", "Medication_Penicillin",</w:t>
+        <w:br/>
+        <w:t xml:space="preserve">    ]</w:t>
+        <w:br/>
+        <w:t xml:space="preserve">    cols = [c for c in cols if c in df.columns]</w:t>
+        <w:br/>
+        <w:t xml:space="preserve">    res = analizar_correlaciones(</w:t>
+        <w:br/>
+        <w:t xml:space="preserve">        df, columnas=cols, top_n=15, annot=True, figsize=(9, 7),</w:t>
+        <w:br/>
+        <w:t xml:space="preserve">        triangulo=False, mostrar=False,</w:t>
+        <w:br/>
+        <w:t xml:space="preserve">        guardar_ruta=str(base / "docs" / "heatmap_correlaciones.png"),</w:t>
+        <w:br/>
+        <w:t xml:space="preserve">    )</w:t>
+        <w:br/>
+        <w:t xml:space="preserve">    print(res["top_pares"].to_string(index=False))</w:t>
+        <w:br/>
       </w:r>
     </w:p>
     <w:p>
@@ -4148,6 +5627,19 @@
           <w:sz w:val="24"/>
         </w:rPr>
         <w:t>prasad22. (2024). Healthcare dataset [Conjunto de datos]. Kaggle. https://www.kaggle.com/datasets/prasad22/healthcare-dataset</w:t>
+      </w:r>
+    </w:p>
+    <w:p>
+      <w:pPr>
+        <w:spacing w:line="480" w:lineRule="auto" w:after="0"/>
+        <w:ind w:hanging="720" w:left="720"/>
+      </w:pPr>
+      <w:r>
+        <w:rPr>
+          <w:rFonts w:ascii="Times New Roman" w:hAnsi="Times New Roman"/>
+          <w:sz w:val="24"/>
+        </w:rPr>
+        <w:t>U.S. Food and Drug Administration. (2024). Drugs@FDA (Drugs_product) [Conjunto de datos]. https://www.fda.gov/drugs/drug-approvals-and-databases/drugsfda-data-files</w:t>
       </w:r>
     </w:p>
     <w:sectPr>

</xml_diff>